<commit_message>
debs rule und logging umgesetzt
</commit_message>
<xml_diff>
--- a/PlayGround/tracking.docx
+++ b/PlayGround/tracking.docx
@@ -696,6 +696,7 @@
       </w:pPr>
       <w:r>
         <w:rPr>
+          <w:noProof/>
           <w:lang w:val="en-US"/>
         </w:rPr>
         <w:drawing>
@@ -1079,6 +1080,7 @@
       </w:pPr>
       <w:r>
         <w:rPr>
+          <w:noProof/>
           <w:lang w:val="en-US"/>
         </w:rPr>
         <w:drawing>
@@ -1291,7 +1293,7 @@
         <w:rPr>
           <w:lang w:val="en-US"/>
         </w:rPr>
-        <w:t>6s</w:t>
+        <w:t>4s</w:t>
       </w:r>
     </w:p>
     <w:p>
@@ -1332,7 +1334,7 @@
         <w:rPr>
           <w:lang w:val="en-US"/>
         </w:rPr>
-        <w:t>64(0.03690429323121039), '</w:t>
+        <w:t>64(0.033925380267273375), '</w:t>
       </w:r>
       <w:proofErr w:type="spellStart"/>
       <w:r>
@@ -1444,7 +1446,7 @@
         <w:rPr>
           <w:lang w:val="en-US"/>
         </w:rPr>
-        <w:t>64(6.141890877244843)</w:t>
+        <w:t>64(7.056022426831796),</w:t>
       </w:r>
     </w:p>
     <w:p>
@@ -1465,7 +1467,7 @@
         <w:rPr>
           <w:lang w:val="en-US"/>
         </w:rPr>
-        <w:t>deg]: 67.968</w:t>
+        <w:t>deg]: 90.502</w:t>
       </w:r>
       <w:proofErr w:type="gramStart"/>
       <w:r>
@@ -1559,7 +1561,7 @@
         <w:rPr>
           <w:lang w:val="en-US"/>
         </w:rPr>
-        <w:t>]: 1.287528</w:t>
+        <w:t>]: 1.281759</w:t>
       </w:r>
       <w:proofErr w:type="gramStart"/>
       <w:r>
@@ -1573,8 +1575,15 @@
         <w:rPr>
           <w:lang w:val="en-US"/>
         </w:rPr>
-        <w:t>= 2.195 dB)</w:t>
-      </w:r>
+        <w:t>= 2.156 dB)</w:t>
+      </w:r>
+    </w:p>
+    <w:p>
+      <w:pPr>
+        <w:rPr>
+          <w:lang w:val="en-US"/>
+        </w:rPr>
+      </w:pPr>
     </w:p>
     <w:p>
       <w:pPr>
@@ -1587,10 +1596,10 @@
           <w:lang w:val="en-US"/>
         </w:rPr>
         <w:drawing>
-          <wp:inline distT="0" distB="0" distL="0" distR="0" wp14:anchorId="4B4138D1" wp14:editId="202D7621">
-            <wp:extent cx="5563376" cy="4391638"/>
+          <wp:inline distT="0" distB="0" distL="0" distR="0" wp14:anchorId="2CF83457" wp14:editId="48FCC56C">
+            <wp:extent cx="5639587" cy="4372585"/>
             <wp:effectExtent l="0" t="0" r="0" b="9525"/>
-            <wp:docPr id="1534111721" name="Grafik 1"/>
+            <wp:docPr id="313996627" name="Grafik 1"/>
             <wp:cNvGraphicFramePr>
               <a:graphicFrameLocks xmlns:a="http://schemas.openxmlformats.org/drawingml/2006/main" noChangeAspect="1"/>
             </wp:cNvGraphicFramePr>
@@ -1598,7 +1607,7 @@
               <a:graphicData uri="http://schemas.openxmlformats.org/drawingml/2006/picture">
                 <pic:pic xmlns:pic="http://schemas.openxmlformats.org/drawingml/2006/picture">
                   <pic:nvPicPr>
-                    <pic:cNvPr id="1534111721" name=""/>
+                    <pic:cNvPr id="313996627" name=""/>
                     <pic:cNvPicPr/>
                   </pic:nvPicPr>
                   <pic:blipFill>
@@ -1610,7 +1619,7 @@
                   <pic:spPr>
                     <a:xfrm>
                       <a:off x="0" y="0"/>
-                      <a:ext cx="5563376" cy="4391638"/>
+                      <a:ext cx="5639587" cy="4372585"/>
                     </a:xfrm>
                     <a:prstGeom prst="rect">
                       <a:avLst/>
@@ -1629,48 +1638,387 @@
           <w:lang w:val="en-US"/>
         </w:rPr>
       </w:pPr>
-      <w:r>
-        <w:rPr>
-          <w:lang w:val="en-US"/>
-        </w:rPr>
-        <w:t xml:space="preserve">??? </w:t>
-      </w:r>
-      <w:proofErr w:type="spellStart"/>
-      <w:r>
-        <w:rPr>
-          <w:lang w:val="en-US"/>
-        </w:rPr>
-        <w:t>warum</w:t>
-      </w:r>
-      <w:proofErr w:type="spellEnd"/>
-      <w:r>
-        <w:rPr>
-          <w:lang w:val="en-US"/>
-        </w:rPr>
-        <w:t xml:space="preserve"> </w:t>
-      </w:r>
-      <w:proofErr w:type="spellStart"/>
-      <w:r>
-        <w:rPr>
-          <w:lang w:val="en-US"/>
-        </w:rPr>
-        <w:t>wird</w:t>
-      </w:r>
-      <w:proofErr w:type="spellEnd"/>
-      <w:r>
-        <w:rPr>
-          <w:lang w:val="en-US"/>
-        </w:rPr>
-        <w:t xml:space="preserve"> PM nicht </w:t>
-      </w:r>
-      <w:proofErr w:type="spellStart"/>
-      <w:r>
-        <w:rPr>
-          <w:lang w:val="en-US"/>
-        </w:rPr>
-        <w:t>aussortiert</w:t>
-      </w:r>
-      <w:proofErr w:type="spellEnd"/>
+    </w:p>
+    <w:p>
+      <w:pPr>
+        <w:rPr>
+          <w:lang w:val="en-US"/>
+        </w:rPr>
+      </w:pPr>
+    </w:p>
+    <w:p>
+      <w:pPr>
+        <w:rPr>
+          <w:lang w:val="en-US"/>
+        </w:rPr>
+      </w:pPr>
+    </w:p>
+    <w:p>
+      <w:proofErr w:type="spellStart"/>
+      <w:r>
+        <w:lastRenderedPageBreak/>
+        <w:t>swarm_size</w:t>
+      </w:r>
+      <w:proofErr w:type="spellEnd"/>
+      <w:r>
+        <w:t xml:space="preserve"> = 400</w:t>
+      </w:r>
+    </w:p>
+    <w:p>
+      <w:pPr>
+        <w:rPr>
+          <w:lang w:val="en-US"/>
+        </w:rPr>
+      </w:pPr>
+      <w:r>
+        <w:rPr>
+          <w:lang w:val="en-US"/>
+        </w:rPr>
+        <w:t>63s</w:t>
+      </w:r>
+    </w:p>
+    <w:p>
+      <w:pPr>
+        <w:rPr>
+          <w:lang w:val="en-US"/>
+        </w:rPr>
+      </w:pPr>
+      <w:r>
+        <w:rPr>
+          <w:lang w:val="en-US"/>
+        </w:rPr>
+        <w:t>{'</w:t>
+      </w:r>
+      <w:proofErr w:type="spellStart"/>
+      <w:r>
+        <w:rPr>
+          <w:lang w:val="en-US"/>
+        </w:rPr>
+        <w:t>best_Kp</w:t>
+      </w:r>
+      <w:proofErr w:type="spellEnd"/>
+      <w:r>
+        <w:rPr>
+          <w:lang w:val="en-US"/>
+        </w:rPr>
+        <w:t xml:space="preserve">': </w:t>
+      </w:r>
+      <w:proofErr w:type="gramStart"/>
+      <w:r>
+        <w:rPr>
+          <w:lang w:val="en-US"/>
+        </w:rPr>
+        <w:t>np.float</w:t>
+      </w:r>
+      <w:proofErr w:type="gramEnd"/>
+      <w:r>
+        <w:rPr>
+          <w:lang w:val="en-US"/>
+        </w:rPr>
+        <w:t>64(0.03395330523997002), '</w:t>
+      </w:r>
+      <w:proofErr w:type="spellStart"/>
+      <w:r>
+        <w:rPr>
+          <w:lang w:val="en-US"/>
+        </w:rPr>
+        <w:t>best_Ti</w:t>
+      </w:r>
+      <w:proofErr w:type="spellEnd"/>
+      <w:r>
+        <w:rPr>
+          <w:lang w:val="en-US"/>
+        </w:rPr>
+        <w:t xml:space="preserve">': </w:t>
+      </w:r>
+      <w:proofErr w:type="gramStart"/>
+      <w:r>
+        <w:rPr>
+          <w:lang w:val="en-US"/>
+        </w:rPr>
+        <w:t>np.float</w:t>
+      </w:r>
+      <w:proofErr w:type="gramEnd"/>
+      <w:r>
+        <w:rPr>
+          <w:lang w:val="en-US"/>
+        </w:rPr>
+        <w:t>64(0.1), '</w:t>
+      </w:r>
+      <w:proofErr w:type="spellStart"/>
+      <w:r>
+        <w:rPr>
+          <w:lang w:val="en-US"/>
+        </w:rPr>
+        <w:t>best_Td</w:t>
+      </w:r>
+      <w:proofErr w:type="spellEnd"/>
+      <w:r>
+        <w:rPr>
+          <w:lang w:val="en-US"/>
+        </w:rPr>
+        <w:t xml:space="preserve">': </w:t>
+      </w:r>
+      <w:proofErr w:type="gramStart"/>
+      <w:r>
+        <w:rPr>
+          <w:lang w:val="en-US"/>
+        </w:rPr>
+        <w:t>np.float</w:t>
+      </w:r>
+      <w:proofErr w:type="gramEnd"/>
+      <w:r>
+        <w:rPr>
+          <w:lang w:val="en-US"/>
+        </w:rPr>
+        <w:t>64(9.827824403872798), '</w:t>
+      </w:r>
+      <w:proofErr w:type="spellStart"/>
+      <w:r>
+        <w:rPr>
+          <w:lang w:val="en-US"/>
+        </w:rPr>
+        <w:t>performance_index</w:t>
+      </w:r>
+      <w:proofErr w:type="spellEnd"/>
+      <w:r>
+        <w:rPr>
+          <w:lang w:val="en-US"/>
+        </w:rPr>
+        <w:t>': &lt;</w:t>
+      </w:r>
+      <w:proofErr w:type="spellStart"/>
+      <w:r>
+        <w:rPr>
+          <w:lang w:val="en-US"/>
+        </w:rPr>
+        <w:t>PerformanceIndex.ITAE</w:t>
+      </w:r>
+      <w:proofErr w:type="spellEnd"/>
+      <w:r>
+        <w:rPr>
+          <w:lang w:val="en-US"/>
+        </w:rPr>
+        <w:t>: 3&gt;, '</w:t>
+      </w:r>
+      <w:proofErr w:type="spellStart"/>
+      <w:r>
+        <w:rPr>
+          <w:lang w:val="en-US"/>
+        </w:rPr>
+        <w:t>best_performance_index</w:t>
+      </w:r>
+      <w:proofErr w:type="spellEnd"/>
+      <w:r>
+        <w:rPr>
+          <w:lang w:val="en-US"/>
+        </w:rPr>
+        <w:t xml:space="preserve">': </w:t>
+      </w:r>
+      <w:proofErr w:type="gramStart"/>
+      <w:r>
+        <w:rPr>
+          <w:lang w:val="en-US"/>
+        </w:rPr>
+        <w:t>np.float</w:t>
+      </w:r>
+      <w:proofErr w:type="gramEnd"/>
+      <w:r>
+        <w:rPr>
+          <w:lang w:val="en-US"/>
+        </w:rPr>
+        <w:t xml:space="preserve">64(7.036121969865177), </w:t>
+      </w:r>
+      <w:proofErr w:type="gramStart"/>
+      <w:r>
+        <w:rPr>
+          <w:lang w:val="en-US"/>
+        </w:rPr>
+        <w:t>'plant</w:t>
+      </w:r>
+      <w:proofErr w:type="gramEnd"/>
+      <w:r>
+        <w:rPr>
+          <w:lang w:val="en-US"/>
+        </w:rPr>
+        <w:t xml:space="preserve">': </w:t>
+      </w:r>
+    </w:p>
+    <w:p>
+      <w:pPr>
+        <w:rPr>
+          <w:lang w:val="en-US"/>
+        </w:rPr>
+      </w:pPr>
+      <w:proofErr w:type="gramStart"/>
+      <w:r>
+        <w:rPr>
+          <w:lang w:val="en-US"/>
+        </w:rPr>
+        <w:t>PM  [</w:t>
+      </w:r>
+      <w:proofErr w:type="gramEnd"/>
+      <w:r>
+        <w:rPr>
+          <w:lang w:val="en-US"/>
+        </w:rPr>
+        <w:t>deg]: 90.493</w:t>
+      </w:r>
+      <w:proofErr w:type="gramStart"/>
+      <w:r>
+        <w:rPr>
+          <w:lang w:val="en-US"/>
+        </w:rPr>
+        <w:t xml:space="preserve">   (</w:t>
+      </w:r>
+      <w:proofErr w:type="spellStart"/>
+      <w:proofErr w:type="gramEnd"/>
+      <w:r>
+        <w:rPr>
+          <w:lang w:val="en-US"/>
+        </w:rPr>
+        <w:t>has_wc</w:t>
+      </w:r>
+      <w:proofErr w:type="spellEnd"/>
+      <w:r>
+        <w:rPr>
+          <w:lang w:val="en-US"/>
+        </w:rPr>
+        <w:t>=True)</w:t>
+      </w:r>
+    </w:p>
+    <w:p>
+      <w:pPr>
+        <w:rPr>
+          <w:lang w:val="en-US"/>
+        </w:rPr>
+      </w:pPr>
+      <w:proofErr w:type="gramStart"/>
+      <w:r>
+        <w:rPr>
+          <w:lang w:val="en-US"/>
+        </w:rPr>
+        <w:t>GM  [dB ]</w:t>
+      </w:r>
+      <w:proofErr w:type="gramEnd"/>
+      <w:r>
+        <w:rPr>
+          <w:lang w:val="en-US"/>
+        </w:rPr>
+        <w:t>: inf</w:t>
+      </w:r>
+      <w:proofErr w:type="gramStart"/>
+      <w:r>
+        <w:rPr>
+          <w:lang w:val="en-US"/>
+        </w:rPr>
+        <w:t xml:space="preserve">   (</w:t>
+      </w:r>
+      <w:proofErr w:type="gramEnd"/>
+      <w:r>
+        <w:rPr>
+          <w:lang w:val="en-US"/>
+        </w:rPr>
+        <w:t>has_w180=False)</w:t>
+      </w:r>
+    </w:p>
+    <w:p>
+      <w:pPr>
+        <w:rPr>
+          <w:lang w:val="en-US"/>
+        </w:rPr>
+      </w:pPr>
+      <w:proofErr w:type="spellStart"/>
+      <w:proofErr w:type="gramStart"/>
+      <w:r>
+        <w:rPr>
+          <w:lang w:val="en-US"/>
+        </w:rPr>
+        <w:t>Ms</w:t>
+      </w:r>
+      <w:proofErr w:type="spellEnd"/>
+      <w:r>
+        <w:rPr>
+          <w:lang w:val="en-US"/>
+        </w:rPr>
+        <w:t xml:space="preserve">  [</w:t>
+      </w:r>
+      <w:proofErr w:type="spellStart"/>
+      <w:proofErr w:type="gramEnd"/>
+      <w:r>
+        <w:rPr>
+          <w:lang w:val="en-US"/>
+        </w:rPr>
+        <w:t>lin</w:t>
+      </w:r>
+      <w:proofErr w:type="spellEnd"/>
+      <w:r>
+        <w:rPr>
+          <w:lang w:val="en-US"/>
+        </w:rPr>
+        <w:t>]: 1.325497</w:t>
+      </w:r>
+      <w:proofErr w:type="gramStart"/>
+      <w:r>
+        <w:rPr>
+          <w:lang w:val="en-US"/>
+        </w:rPr>
+        <w:t xml:space="preserve">   (</w:t>
+      </w:r>
+      <w:proofErr w:type="gramEnd"/>
+      <w:r>
+        <w:rPr>
+          <w:lang w:val="en-US"/>
+        </w:rPr>
+        <w:t>= 2.448 dB)</w:t>
+      </w:r>
+    </w:p>
+    <w:p>
+      <w:pPr>
+        <w:rPr>
+          <w:lang w:val="en-US"/>
+        </w:rPr>
+      </w:pPr>
+      <w:r>
+        <w:rPr>
+          <w:lang w:val="en-US"/>
+        </w:rPr>
+        <w:drawing>
+          <wp:inline distT="0" distB="0" distL="0" distR="0" wp14:anchorId="7513E7C7" wp14:editId="17AFB22F">
+            <wp:extent cx="5668166" cy="4353533"/>
+            <wp:effectExtent l="0" t="0" r="0" b="9525"/>
+            <wp:docPr id="2061763592" name="Grafik 1"/>
+            <wp:cNvGraphicFramePr>
+              <a:graphicFrameLocks xmlns:a="http://schemas.openxmlformats.org/drawingml/2006/main" noChangeAspect="1"/>
+            </wp:cNvGraphicFramePr>
+            <a:graphic xmlns:a="http://schemas.openxmlformats.org/drawingml/2006/main">
+              <a:graphicData uri="http://schemas.openxmlformats.org/drawingml/2006/picture">
+                <pic:pic xmlns:pic="http://schemas.openxmlformats.org/drawingml/2006/picture">
+                  <pic:nvPicPr>
+                    <pic:cNvPr id="2061763592" name=""/>
+                    <pic:cNvPicPr/>
+                  </pic:nvPicPr>
+                  <pic:blipFill>
+                    <a:blip r:embed="rId7"/>
+                    <a:stretch>
+                      <a:fillRect/>
+                    </a:stretch>
+                  </pic:blipFill>
+                  <pic:spPr>
+                    <a:xfrm>
+                      <a:off x="0" y="0"/>
+                      <a:ext cx="5668166" cy="4353533"/>
+                    </a:xfrm>
+                    <a:prstGeom prst="rect">
+                      <a:avLst/>
+                    </a:prstGeom>
+                  </pic:spPr>
+                </pic:pic>
+              </a:graphicData>
+            </a:graphic>
+          </wp:inline>
+        </w:drawing>
+      </w:r>
     </w:p>
     <w:sectPr>
       <w:pgSz w:w="11906" w:h="16838"/>

</xml_diff>